<commit_message>
changes for mock presentation 10/03
</commit_message>
<xml_diff>
--- a/Lotka-Volterra/calibration rough results.docx
+++ b/Lotka-Volterra/calibration rough results.docx
@@ -21,13 +21,8 @@
       </w:r>
     </w:p>
     <w:p>
-      <w:proofErr w:type="spellStart"/>
-      <w:r>
-        <w:t>N_theta</w:t>
-      </w:r>
-      <w:proofErr w:type="spellEnd"/>
-      <w:r>
-        <w:t xml:space="preserve"> = 500</w:t>
+      <w:r>
+        <w:t>N_theta = 500</w:t>
       </w:r>
     </w:p>
     <w:p>
@@ -86,15 +81,7 @@
     <w:p>
       <w:r>
         <w:lastRenderedPageBreak/>
-        <w:t xml:space="preserve">N=200, </w:t>
-      </w:r>
-      <w:proofErr w:type="spellStart"/>
-      <w:r>
-        <w:t>N_theta</w:t>
-      </w:r>
-      <w:proofErr w:type="spellEnd"/>
-      <w:r>
-        <w:t xml:space="preserve"> =2500</w:t>
+        <w:t>N=200, N_theta =2500</w:t>
       </w:r>
     </w:p>
     <w:p>
@@ -155,13 +142,8 @@
     <w:p/>
     <w:p>
       <w:r>
-        <w:t xml:space="preserve">Plotted mean and std dev and error vs </w:t>
-      </w:r>
-      <w:proofErr w:type="spellStart"/>
-      <w:r>
-        <w:t>N_theta</w:t>
-      </w:r>
-      <w:proofErr w:type="spellEnd"/>
+        <w:t>Plotted mean and std dev and error vs N_theta</w:t>
+      </w:r>
     </w:p>
     <w:p/>
     <w:p>
@@ -403,15 +385,7 @@
     <w:p>
       <w:r>
         <w:lastRenderedPageBreak/>
-        <w:t xml:space="preserve">3% increase in lynx pop: clearly detected led to increase in crit </w:t>
-      </w:r>
-      <w:proofErr w:type="spellStart"/>
-      <w:r>
-        <w:t>val</w:t>
-      </w:r>
-      <w:proofErr w:type="spellEnd"/>
-      <w:r>
-        <w:t xml:space="preserve"> and flattening of peak</w:t>
+        <w:t>3% increase in lynx pop: clearly detected led to increase in crit val and flattening of peak</w:t>
       </w:r>
     </w:p>
     <w:p>
@@ -474,23 +448,7 @@
     </w:p>
     <w:p>
       <w:r>
-        <w:t xml:space="preserve">LV Changes – added noise to </w:t>
-      </w:r>
-      <w:proofErr w:type="spellStart"/>
-      <w:r>
-        <w:t>x_observed</w:t>
-      </w:r>
-      <w:proofErr w:type="spellEnd"/>
-      <w:r>
-        <w:t xml:space="preserve">, moved to </w:t>
-      </w:r>
-      <w:proofErr w:type="spellStart"/>
-      <w:r>
-        <w:t>logn</w:t>
-      </w:r>
-      <w:proofErr w:type="spellEnd"/>
-      <w:r>
-        <w:t xml:space="preserve"> prior</w:t>
+        <w:t>LV Changes – added noise to x_observed, moved to logn prior</w:t>
       </w:r>
     </w:p>
     <w:p/>
@@ -657,15 +615,7 @@
         </w:drawing>
       </w:r>
       <w:r>
-        <w:t xml:space="preserve">split 1 and split 2 noisy </w:t>
-      </w:r>
-      <w:proofErr w:type="spellStart"/>
-      <w:r>
-        <w:t>x_obs</w:t>
-      </w:r>
-      <w:proofErr w:type="spellEnd"/>
-      <w:r>
-        <w:t xml:space="preserve"> plus prior predictive checks – performing better, need to shift dim3 </w:t>
+        <w:t xml:space="preserve">split 1 and split 2 noisy x_obs plus prior predictive checks – performing better, need to shift dim3 </w:t>
       </w:r>
     </w:p>
     <w:p/>
@@ -922,15 +872,7 @@
     <w:p>
       <w:r>
         <w:lastRenderedPageBreak/>
-        <w:t xml:space="preserve">Now look at adding 3% lynx perturbation and see how this is realised in KL. Interestingly, test is not sensitive compared to last </w:t>
-      </w:r>
-      <w:proofErr w:type="spellStart"/>
-      <w:r>
-        <w:t>weeks</w:t>
-      </w:r>
-      <w:proofErr w:type="spellEnd"/>
-      <w:r>
-        <w:t xml:space="preserve"> result.</w:t>
+        <w:t>Now look at adding 3% lynx perturbation and see how this is realised in KL. Interestingly, test is not sensitive compared to last weeks result.</w:t>
       </w:r>
     </w:p>
     <w:p>
@@ -1175,15 +1117,7 @@
         <w:sym w:font="Wingdings" w:char="F0E0"/>
       </w:r>
       <w:r>
-        <w:t xml:space="preserve"> </w:t>
-      </w:r>
-      <w:proofErr w:type="gramStart"/>
-      <w:r>
-        <w:t>unphysical ??</w:t>
-      </w:r>
-      <w:proofErr w:type="gramEnd"/>
-      <w:r>
-        <w:t xml:space="preserve"> How to enforce this as at population 0, you wipe out, so do we have to decrease noise as population lowers? Maybe realistic?</w:t>
+        <w:t xml:space="preserve"> unphysical ?? How to enforce this as at population 0, you wipe out, so do we have to decrease noise as population lowers? Maybe realistic?</w:t>
       </w:r>
     </w:p>
     <w:p>
@@ -1261,15 +1195,7 @@
     <w:p/>
     <w:p>
       <w:r>
-        <w:t xml:space="preserve">Training seems </w:t>
-      </w:r>
-      <w:proofErr w:type="gramStart"/>
-      <w:r>
-        <w:t>better ,</w:t>
-      </w:r>
-      <w:proofErr w:type="gramEnd"/>
-      <w:r>
-        <w:t xml:space="preserve"> again note 150 epochs only.</w:t>
+        <w:t>Training seems better , again note 150 epochs only.</w:t>
       </w:r>
     </w:p>
     <w:p>
@@ -1545,49 +1471,12 @@
     </w:p>
     <w:p>
       <w:r>
-        <w:t xml:space="preserve">Prior: </w:t>
-      </w:r>
-      <w:proofErr w:type="spellStart"/>
-      <w:r>
-        <w:t>theta_i</w:t>
-      </w:r>
-      <w:proofErr w:type="spellEnd"/>
-      <w:r>
-        <w:t xml:space="preserve"> ~ </w:t>
-      </w:r>
-      <w:proofErr w:type="gramStart"/>
-      <w:r>
-        <w:t>N(</w:t>
-      </w:r>
-      <w:proofErr w:type="gramEnd"/>
-      <w:r>
-        <w:t>1,2), independent</w:t>
-      </w:r>
-    </w:p>
-    <w:p>
-      <w:r>
-        <w:t>Likelihood: f(</w:t>
-      </w:r>
-      <w:proofErr w:type="spellStart"/>
-      <w:r>
-        <w:t>x_i|theta_i</w:t>
-      </w:r>
-      <w:proofErr w:type="spellEnd"/>
-      <w:r>
-        <w:t xml:space="preserve">) = </w:t>
-      </w:r>
-      <w:proofErr w:type="gramStart"/>
-      <w:r>
-        <w:t>N(</w:t>
-      </w:r>
-      <w:proofErr w:type="spellStart"/>
-      <w:proofErr w:type="gramEnd"/>
-      <w:r>
-        <w:t>theta_i</w:t>
-      </w:r>
-      <w:proofErr w:type="spellEnd"/>
-      <w:r>
-        <w:t xml:space="preserve"> + loc, scale)</w:t>
+        <w:t>Prior: theta_i ~ N(1,2), independent</w:t>
+      </w:r>
+    </w:p>
+    <w:p>
+      <w:r>
+        <w:t>Likelihood: f(x_i|theta_i) = N(theta_i + loc, scale)</w:t>
       </w:r>
     </w:p>
     <w:p>
@@ -1629,45 +1518,13 @@
         <w:t xml:space="preserve">, </w:t>
       </w:r>
       <w:r>
-        <w:t>i =</w:t>
-      </w:r>
-      <w:proofErr w:type="gramStart"/>
-      <w:r>
-        <w:t>1,..</w:t>
-      </w:r>
-      <w:proofErr w:type="gramEnd"/>
-      <w:r>
-        <w:t xml:space="preserve">N, and plug into simulator 1 with loc1, scale1 then into simulator 2 with loc2, scale 2. Train each split and compare. Generate one </w:t>
-      </w:r>
-      <w:proofErr w:type="spellStart"/>
-      <w:r>
-        <w:t>theta_obs</w:t>
-      </w:r>
-      <w:proofErr w:type="spellEnd"/>
-      <w:r>
-        <w:t xml:space="preserve">, put in </w:t>
-      </w:r>
-      <w:proofErr w:type="spellStart"/>
-      <w:r>
-        <w:t>sim_i</w:t>
-      </w:r>
-      <w:proofErr w:type="spellEnd"/>
-      <w:r>
-        <w:t xml:space="preserve"> </w:t>
+        <w:t xml:space="preserve">i =1,..N, and plug into simulator 1 with loc1, scale1 then into simulator 2 with loc2, scale 2. Train each split and compare. Generate one theta_obs, put in sim_i </w:t>
       </w:r>
       <w:r>
         <w:sym w:font="Wingdings" w:char="F0E0"/>
       </w:r>
       <w:r>
-        <w:t xml:space="preserve"> </w:t>
-      </w:r>
-      <w:proofErr w:type="spellStart"/>
-      <w:r>
-        <w:t>x_obs_i</w:t>
-      </w:r>
-      <w:proofErr w:type="spellEnd"/>
-      <w:r>
-        <w:t xml:space="preserve">, </w:t>
+        <w:t xml:space="preserve"> x_obs_i, </w:t>
       </w:r>
     </w:p>
     <w:p>
@@ -1926,13 +1783,8 @@
         <w:t>parameter and simulat</w:t>
       </w:r>
       <w:r>
-        <w:t xml:space="preserve">ed draws from parameters, compared to </w:t>
-      </w:r>
-      <w:proofErr w:type="spellStart"/>
-      <w:r>
-        <w:t>obs</w:t>
-      </w:r>
-      <w:proofErr w:type="spellEnd"/>
+        <w:t>ed draws from parameters, compared to obs</w:t>
+      </w:r>
       <w:r>
         <w:t>:</w:t>
       </w:r>
@@ -2113,23 +1965,7 @@
         </w:drawing>
       </w:r>
       <w:r>
-        <w:t xml:space="preserve">Next </w:t>
-      </w:r>
-      <w:proofErr w:type="spellStart"/>
-      <w:r>
-        <w:t>graoh</w:t>
-      </w:r>
-      <w:proofErr w:type="spellEnd"/>
-      <w:r>
-        <w:t xml:space="preserve"> is </w:t>
-      </w:r>
-      <w:proofErr w:type="spellStart"/>
-      <w:r>
-        <w:t>gpt</w:t>
-      </w:r>
-      <w:proofErr w:type="spellEnd"/>
-      <w:r>
-        <w:t xml:space="preserve"> generated, but shows 2d overlay of posterior:</w:t>
+        <w:t>Next graoh is gpt generated, but shows 2d overlay of posterior:</w:t>
       </w:r>
     </w:p>
     <w:p/>
@@ -2322,15 +2158,7 @@
     <w:p/>
     <w:p>
       <w:r>
-        <w:t xml:space="preserve">Adding a perturbation. As we can’t differentiate splitting by odd/even first second as draws </w:t>
-      </w:r>
-      <w:proofErr w:type="spellStart"/>
-      <w:r>
-        <w:t>indpt</w:t>
-      </w:r>
-      <w:proofErr w:type="spellEnd"/>
-      <w:r>
-        <w:t>, tried adding different perturbations to see sensitivity:</w:t>
+        <w:t>Adding a perturbation. As we can’t differentiate splitting by odd/even first second as draws indpt, tried adding different perturbations to see sensitivity:</w:t>
       </w:r>
     </w:p>
     <w:p/>
@@ -2396,15 +2224,7 @@
         </w:drawing>
       </w:r>
       <w:r>
-        <w:t xml:space="preserve">Shifted mean by 0.1: no/small change in crit </w:t>
-      </w:r>
-      <w:proofErr w:type="spellStart"/>
-      <w:r>
-        <w:t>val</w:t>
-      </w:r>
-      <w:proofErr w:type="spellEnd"/>
-      <w:r>
-        <w:t xml:space="preserve">: </w:t>
+        <w:t xml:space="preserve">Shifted mean by 0.1: no/small change in crit val: </w:t>
       </w:r>
     </w:p>
     <w:p>
@@ -2479,15 +2299,7 @@
         <w:t>Question</w:t>
       </w:r>
       <w:r>
-        <w:t xml:space="preserve">: need a method to say what shift in crit </w:t>
-      </w:r>
-      <w:proofErr w:type="spellStart"/>
-      <w:r>
-        <w:t>val</w:t>
-      </w:r>
-      <w:proofErr w:type="spellEnd"/>
-      <w:r>
-        <w:t xml:space="preserve"> is enough to deem significant?</w:t>
+        <w:t>: need a method to say what shift in crit val is enough to deem significant?</w:t>
       </w:r>
       <w:r>
         <w:t xml:space="preserve"> –.</w:t>
@@ -2496,31 +2308,7 @@
     <w:p>
       <w:r>
         <w:lastRenderedPageBreak/>
-        <w:t xml:space="preserve">Q: what is a sensible way of choosing a crit </w:t>
-      </w:r>
-      <w:proofErr w:type="spellStart"/>
-      <w:r>
-        <w:t>val</w:t>
-      </w:r>
-      <w:proofErr w:type="spellEnd"/>
-      <w:r>
-        <w:t xml:space="preserve">, as </w:t>
-      </w:r>
-      <w:proofErr w:type="spellStart"/>
-      <w:r>
-        <w:t>im</w:t>
-      </w:r>
-      <w:proofErr w:type="spellEnd"/>
-      <w:r>
-        <w:t xml:space="preserve"> using 95 </w:t>
-      </w:r>
-      <w:proofErr w:type="gramStart"/>
-      <w:r>
-        <w:t>percentile</w:t>
-      </w:r>
-      <w:proofErr w:type="gramEnd"/>
-      <w:r>
-        <w:t xml:space="preserve"> but are there better choices?</w:t>
+        <w:t>Q: what is a sensible way of choosing a crit val, as im using 95 percentile but are there better choices?</w:t>
       </w:r>
     </w:p>
     <w:p/>
@@ -2534,58 +2322,8 @@
         <w:rPr>
           <w:color w:val="EE0000"/>
         </w:rPr>
-        <w:t xml:space="preserve">This graph: incorrect but interesting, was kl calibrated for a </w:t>
-      </w:r>
-      <w:proofErr w:type="spellStart"/>
-      <w:r>
-        <w:rPr>
-          <w:color w:val="EE0000"/>
-        </w:rPr>
-        <w:t>splti</w:t>
-      </w:r>
-      <w:proofErr w:type="spellEnd"/>
-      <w:r>
-        <w:rPr>
-          <w:color w:val="EE0000"/>
-        </w:rPr>
-        <w:t xml:space="preserve"> with noise 1 and a split with noise 2. Interesting as shows sensitivity, </w:t>
-      </w:r>
-      <w:proofErr w:type="spellStart"/>
-      <w:r>
-        <w:rPr>
-          <w:color w:val="EE0000"/>
-        </w:rPr>
-        <w:t>tpical</w:t>
-      </w:r>
-      <w:proofErr w:type="spellEnd"/>
-      <w:r>
-        <w:rPr>
-          <w:color w:val="EE0000"/>
-        </w:rPr>
-        <w:t xml:space="preserve"> kl </w:t>
-      </w:r>
-      <w:proofErr w:type="spellStart"/>
-      <w:r>
-        <w:rPr>
-          <w:color w:val="EE0000"/>
-        </w:rPr>
-        <w:t>val</w:t>
-      </w:r>
-      <w:proofErr w:type="spellEnd"/>
-      <w:r>
-        <w:rPr>
-          <w:color w:val="EE0000"/>
-        </w:rPr>
-        <w:t xml:space="preserve"> way higher than when done </w:t>
-      </w:r>
-      <w:proofErr w:type="spellStart"/>
-      <w:r>
-        <w:rPr>
-          <w:color w:val="EE0000"/>
-        </w:rPr>
-        <w:t>correclty</w:t>
-      </w:r>
-      <w:proofErr w:type="spellEnd"/>
+        <w:t>This graph: incorrect but interesting, was kl calibrated for a splti with noise 1 and a split with noise 2. Interesting as shows sensitivity, tpical kl val way higher than when done correclty</w:t>
+      </w:r>
     </w:p>
     <w:p>
       <w:pPr>
@@ -2654,28 +2392,12 @@
     </w:p>
     <w:p>
       <w:r>
-        <w:t xml:space="preserve">Adjusted prior </w:t>
-      </w:r>
-      <w:proofErr w:type="gramStart"/>
-      <w:r>
-        <w:t>weights, and</w:t>
-      </w:r>
-      <w:proofErr w:type="gramEnd"/>
-      <w:r>
-        <w:t xml:space="preserve"> trained for 1000 epochs.</w:t>
-      </w:r>
-    </w:p>
-    <w:p>
-      <w:r>
-        <w:t xml:space="preserve">hard to adjust precisely as considering </w:t>
-      </w:r>
-      <w:proofErr w:type="gramStart"/>
-      <w:r>
-        <w:t>summaries, but</w:t>
-      </w:r>
-      <w:proofErr w:type="gramEnd"/>
-      <w:r>
-        <w:t xml:space="preserve"> changing one param changes all four -&gt; tried some sensitivity matrix thing. </w:t>
+        <w:t>Adjusted prior weights, and trained for 1000 epochs.</w:t>
+      </w:r>
+    </w:p>
+    <w:p>
+      <w:r>
+        <w:t xml:space="preserve">hard to adjust precisely as considering summaries, but changing one param changes all four -&gt; tried some sensitivity matrix thing. </w:t>
       </w:r>
     </w:p>
     <w:p>
@@ -3024,13 +2746,7 @@
           <w:rPr>
             <w:rFonts w:ascii="Cambria Math" w:hAnsi="Cambria Math"/>
           </w:rPr>
-          <m:t>θ∼</m:t>
-        </m:r>
-        <m:r>
-          <w:rPr>
-            <w:rFonts w:ascii="Cambria Math" w:hAnsi="Cambria Math"/>
-          </w:rPr>
-          <m:t>N</m:t>
+          <m:t>θ∼N</m:t>
         </m:r>
         <m:d>
           <m:dPr>
@@ -3563,6 +3279,12 @@
                         </w:rPr>
                         <m:t>eps</m:t>
                       </m:r>
+                      <m:r>
+                        <w:rPr>
+                          <w:rFonts w:ascii="Cambria Math" w:hAnsi="Cambria Math"/>
+                        </w:rPr>
+                        <m:t>*scale</m:t>
+                      </m:r>
                     </m:e>
                   </m:mr>
                   <m:mr>
@@ -3572,6 +3294,12 @@
                           <w:rFonts w:ascii="Cambria Math" w:hAnsi="Cambria Math"/>
                         </w:rPr>
                         <m:t>eps</m:t>
+                      </m:r>
+                      <m:r>
+                        <w:rPr>
+                          <w:rFonts w:ascii="Cambria Math" w:hAnsi="Cambria Math"/>
+                        </w:rPr>
+                        <m:t>*scale</m:t>
                       </m:r>
                     </m:e>
                     <m:e>
@@ -3700,6 +3428,9 @@
     </w:p>
     <w:p>
       <w:r>
+        <w:rPr>
+          <w:noProof/>
+        </w:rPr>
         <w:drawing>
           <wp:inline distT="0" distB="0" distL="0" distR="0" wp14:anchorId="5E2BB383" wp14:editId="481AD3FE">
             <wp:extent cx="5731510" cy="4180205"/>
@@ -3790,7 +3521,10 @@
     </w:p>
     <w:p>
       <w:r>
-        <w:t>Crit value decreases: would we expect this as we now have correlation?</w:t>
+        <w:t>Crit value decreases</w:t>
+      </w:r>
+      <w:r>
+        <w:t xml:space="preserve"> t</w:t>
       </w:r>
     </w:p>
     <w:sectPr>

</xml_diff>